<commit_message>
feat: numeración correcta de secciones, interlineado sencillo y 4 tomos editoriales
- renumber_sections.py: corrige 593 headings en 29 archivos .md
  Los prefijos de sección ahora coinciden con el número de capítulo
  (ej. cap-10: 12.X → 10.X; cap-12: 28.X → 12.X; etc.)
- build_kdp_endure.py: interlineado WD_LINE_SPACING.SINGLE en 6 funciones
  (body, first_para, subhead, bullets, caption, table cells)
- build_kdp_endure.py: BOOK_PARTS + compile_parts() + --compile-parts CLI
  Genera 4 tomos separados para revisión editorial (A/B/C/D)
- build_kdp_endure.py: _clean_template_running_text() elimina "de N" estático
  del header/footer del template KDP para todos los docs generados
- 42 DOCXs por capítulo y 4 tomos editoriales regenerados

Co-Authored-By: Claude Sonnet 4.6 <noreply@anthropic.com>
Claude-Session: https://claude.ai/code/session_01WBhMYcTrowv8ioFVow44Yz
</commit_message>
<xml_diff>
--- a/book/docx-por-capitulo/capitulo-01-inicio-rapido.docx
+++ b/book/docx-por-capitulo/capitulo-01-inicio-rapido.docx
@@ -26,7 +26,7 @@
       <w:pPr>
         <w:pStyle w:val="Endure-Subhead"/>
         <w:keepNext/>
-        <w:spacing w:before="240" w:after="60"/>
+        <w:spacing w:before="240" w:after="60" w:line="240" w:lineRule="auto"/>
         <w:outlineLvl w:val="1"/>
       </w:pPr>
       <w:r>
@@ -39,7 +39,7 @@
     <w:p>
       <w:pPr>
         <w:pStyle w:val="Endure-FirstParagraphBodyText"/>
-        <w:spacing w:before="100" w:after="100"/>
+        <w:spacing w:before="100" w:after="100" w:line="240" w:lineRule="auto"/>
       </w:pPr>
       <w:r>
         <w:rPr>
@@ -77,7 +77,7 @@
     <w:p>
       <w:pPr>
         <w:pStyle w:val="Endure-ChapterBodyText"/>
-        <w:spacing w:before="100" w:after="100"/>
+        <w:spacing w:before="100" w:after="100" w:line="240" w:lineRule="auto"/>
       </w:pPr>
       <w:r>
         <w:rPr>
@@ -90,7 +90,7 @@
       <w:pPr>
         <w:pStyle w:val="Endure-Subhead"/>
         <w:keepNext/>
-        <w:spacing w:before="160" w:after="60"/>
+        <w:spacing w:before="160" w:after="60" w:line="240" w:lineRule="auto"/>
         <w:outlineLvl w:val="2"/>
       </w:pPr>
       <w:r>
@@ -103,7 +103,7 @@
     <w:p>
       <w:pPr>
         <w:pStyle w:val="Endure-ChapterBodyText"/>
-        <w:spacing w:before="40" w:after="40"/>
+        <w:spacing w:before="40" w:after="40" w:line="240" w:lineRule="auto"/>
         <w:ind w:left="360" w:hanging="216"/>
       </w:pPr>
       <w:r>
@@ -129,7 +129,7 @@
     <w:p>
       <w:pPr>
         <w:pStyle w:val="Endure-ChapterBodyText"/>
-        <w:spacing w:before="40" w:after="40"/>
+        <w:spacing w:before="40" w:after="40" w:line="240" w:lineRule="auto"/>
         <w:ind w:left="360" w:hanging="216"/>
       </w:pPr>
       <w:r>
@@ -155,7 +155,7 @@
     <w:p>
       <w:pPr>
         <w:pStyle w:val="Endure-ChapterBodyText"/>
-        <w:spacing w:before="40" w:after="40"/>
+        <w:spacing w:before="40" w:after="40" w:line="240" w:lineRule="auto"/>
         <w:ind w:left="360" w:hanging="216"/>
       </w:pPr>
       <w:r>
@@ -186,7 +186,7 @@
     <w:p>
       <w:pPr>
         <w:pStyle w:val="Endure-ChapterBodyText"/>
-        <w:spacing w:before="100" w:after="100"/>
+        <w:spacing w:before="100" w:after="100" w:line="240" w:lineRule="auto"/>
       </w:pPr>
       <w:r>
         <w:rPr>
@@ -199,7 +199,7 @@
       <w:pPr>
         <w:pStyle w:val="Endure-Subhead"/>
         <w:keepNext/>
-        <w:spacing w:before="160" w:after="60"/>
+        <w:spacing w:before="160" w:after="60" w:line="240" w:lineRule="auto"/>
         <w:outlineLvl w:val="2"/>
       </w:pPr>
       <w:r>
@@ -212,7 +212,7 @@
     <w:p>
       <w:pPr>
         <w:pStyle w:val="Endure-FirstParagraphBodyText"/>
-        <w:spacing w:before="100" w:after="100"/>
+        <w:spacing w:before="100" w:after="100" w:line="240" w:lineRule="auto"/>
       </w:pPr>
       <w:r>
         <w:rPr>
@@ -256,7 +256,7 @@
           </w:tcPr>
           <w:p>
             <w:pPr>
-              <w:spacing w:before="0" w:after="0"/>
+              <w:spacing w:before="0" w:after="0" w:line="240" w:lineRule="auto"/>
               <w:jc w:val="center"/>
             </w:pPr>
             <w:r>
@@ -289,7 +289,7 @@
           </w:tcPr>
           <w:p>
             <w:pPr>
-              <w:spacing w:before="0" w:after="0"/>
+              <w:spacing w:before="0" w:after="0" w:line="240" w:lineRule="auto"/>
               <w:jc w:val="center"/>
             </w:pPr>
             <w:r>
@@ -327,7 +327,7 @@
           </w:tcPr>
           <w:p>
             <w:pPr>
-              <w:spacing w:before="0" w:after="0"/>
+              <w:spacing w:before="0" w:after="0" w:line="240" w:lineRule="auto"/>
               <w:jc w:val="center"/>
             </w:pPr>
             <w:r>
@@ -358,7 +358,7 @@
           </w:tcPr>
           <w:p>
             <w:pPr>
-              <w:spacing w:before="0" w:after="0"/>
+              <w:spacing w:before="0" w:after="0" w:line="240" w:lineRule="auto"/>
               <w:jc w:val="center"/>
             </w:pPr>
             <w:r>
@@ -394,7 +394,7 @@
           </w:tcPr>
           <w:p>
             <w:pPr>
-              <w:spacing w:before="0" w:after="0"/>
+              <w:spacing w:before="0" w:after="0" w:line="240" w:lineRule="auto"/>
               <w:jc w:val="center"/>
             </w:pPr>
             <w:r>
@@ -425,7 +425,7 @@
           </w:tcPr>
           <w:p>
             <w:pPr>
-              <w:spacing w:before="0" w:after="0"/>
+              <w:spacing w:before="0" w:after="0" w:line="240" w:lineRule="auto"/>
               <w:jc w:val="center"/>
             </w:pPr>
             <w:r>
@@ -461,7 +461,7 @@
           </w:tcPr>
           <w:p>
             <w:pPr>
-              <w:spacing w:before="0" w:after="0"/>
+              <w:spacing w:before="0" w:after="0" w:line="240" w:lineRule="auto"/>
               <w:jc w:val="center"/>
             </w:pPr>
             <w:r>
@@ -492,7 +492,7 @@
           </w:tcPr>
           <w:p>
             <w:pPr>
-              <w:spacing w:before="0" w:after="0"/>
+              <w:spacing w:before="0" w:after="0" w:line="240" w:lineRule="auto"/>
               <w:jc w:val="center"/>
             </w:pPr>
             <w:r>
@@ -528,7 +528,7 @@
           </w:tcPr>
           <w:p>
             <w:pPr>
-              <w:spacing w:before="0" w:after="0"/>
+              <w:spacing w:before="0" w:after="0" w:line="240" w:lineRule="auto"/>
               <w:jc w:val="center"/>
             </w:pPr>
             <w:r>
@@ -559,7 +559,7 @@
           </w:tcPr>
           <w:p>
             <w:pPr>
-              <w:spacing w:before="0" w:after="0"/>
+              <w:spacing w:before="0" w:after="0" w:line="240" w:lineRule="auto"/>
               <w:jc w:val="both"/>
             </w:pPr>
             <w:r>
@@ -595,7 +595,7 @@
           </w:tcPr>
           <w:p>
             <w:pPr>
-              <w:spacing w:before="0" w:after="0"/>
+              <w:spacing w:before="0" w:after="0" w:line="240" w:lineRule="auto"/>
               <w:jc w:val="center"/>
             </w:pPr>
             <w:r>
@@ -626,7 +626,7 @@
           </w:tcPr>
           <w:p>
             <w:pPr>
-              <w:spacing w:before="0" w:after="0"/>
+              <w:spacing w:before="0" w:after="0" w:line="240" w:lineRule="auto"/>
               <w:jc w:val="center"/>
             </w:pPr>
             <w:r>
@@ -700,7 +700,7 @@
       <w:pPr>
         <w:pStyle w:val="Endure-Subhead"/>
         <w:keepNext/>
-        <w:spacing w:before="160" w:after="60"/>
+        <w:spacing w:before="160" w:after="60" w:line="240" w:lineRule="auto"/>
         <w:outlineLvl w:val="2"/>
       </w:pPr>
       <w:r>
@@ -713,7 +713,7 @@
     <w:p>
       <w:pPr>
         <w:pStyle w:val="Endure-FirstParagraphBodyText"/>
-        <w:spacing w:before="100" w:after="100"/>
+        <w:spacing w:before="100" w:after="100" w:line="240" w:lineRule="auto"/>
       </w:pPr>
       <w:r>
         <w:rPr>
@@ -725,7 +725,7 @@
     <w:p>
       <w:pPr>
         <w:pStyle w:val="Endure-ChapterBodyText"/>
-        <w:spacing w:before="100" w:after="100"/>
+        <w:spacing w:before="100" w:after="100" w:line="240" w:lineRule="auto"/>
       </w:pPr>
       <w:r>
         <w:rPr>
@@ -804,7 +804,7 @@
     <w:p>
       <w:pPr>
         <w:pStyle w:val="Endure-ChapterBodyText"/>
-        <w:spacing w:before="100" w:after="100"/>
+        <w:spacing w:before="100" w:after="100" w:line="240" w:lineRule="auto"/>
       </w:pPr>
       <w:r>
         <w:rPr>
@@ -883,7 +883,7 @@
     <w:p>
       <w:pPr>
         <w:pStyle w:val="Endure-ChapterBodyText"/>
-        <w:spacing w:before="100" w:after="100"/>
+        <w:spacing w:before="100" w:after="100" w:line="240" w:lineRule="auto"/>
       </w:pPr>
       <w:r>
         <w:rPr>
@@ -928,7 +928,7 @@
           </w:tcPr>
           <w:p>
             <w:pPr>
-              <w:spacing w:before="0" w:after="0"/>
+              <w:spacing w:before="0" w:after="0" w:line="240" w:lineRule="auto"/>
               <w:jc w:val="center"/>
             </w:pPr>
             <w:r>
@@ -961,7 +961,7 @@
           </w:tcPr>
           <w:p>
             <w:pPr>
-              <w:spacing w:before="0" w:after="0"/>
+              <w:spacing w:before="0" w:after="0" w:line="240" w:lineRule="auto"/>
               <w:jc w:val="center"/>
             </w:pPr>
             <w:r>
@@ -999,7 +999,7 @@
           </w:tcPr>
           <w:p>
             <w:pPr>
-              <w:spacing w:before="0" w:after="0"/>
+              <w:spacing w:before="0" w:after="0" w:line="240" w:lineRule="auto"/>
               <w:jc w:val="center"/>
             </w:pPr>
             <w:r>
@@ -1030,7 +1030,7 @@
           </w:tcPr>
           <w:p>
             <w:pPr>
-              <w:spacing w:before="0" w:after="0"/>
+              <w:spacing w:before="0" w:after="0" w:line="240" w:lineRule="auto"/>
               <w:jc w:val="both"/>
             </w:pPr>
             <w:r>
@@ -1066,7 +1066,7 @@
           </w:tcPr>
           <w:p>
             <w:pPr>
-              <w:spacing w:before="0" w:after="0"/>
+              <w:spacing w:before="0" w:after="0" w:line="240" w:lineRule="auto"/>
               <w:jc w:val="center"/>
             </w:pPr>
             <w:r>
@@ -1097,7 +1097,7 @@
           </w:tcPr>
           <w:p>
             <w:pPr>
-              <w:spacing w:before="0" w:after="0"/>
+              <w:spacing w:before="0" w:after="0" w:line="240" w:lineRule="auto"/>
               <w:jc w:val="both"/>
             </w:pPr>
             <w:r>
@@ -1133,7 +1133,7 @@
           </w:tcPr>
           <w:p>
             <w:pPr>
-              <w:spacing w:before="0" w:after="0"/>
+              <w:spacing w:before="0" w:after="0" w:line="240" w:lineRule="auto"/>
               <w:jc w:val="center"/>
             </w:pPr>
             <w:r>
@@ -1164,7 +1164,7 @@
           </w:tcPr>
           <w:p>
             <w:pPr>
-              <w:spacing w:before="0" w:after="0"/>
+              <w:spacing w:before="0" w:after="0" w:line="240" w:lineRule="auto"/>
               <w:jc w:val="both"/>
             </w:pPr>
             <w:r>
@@ -1200,7 +1200,7 @@
           </w:tcPr>
           <w:p>
             <w:pPr>
-              <w:spacing w:before="0" w:after="0"/>
+              <w:spacing w:before="0" w:after="0" w:line="240" w:lineRule="auto"/>
               <w:jc w:val="center"/>
             </w:pPr>
             <w:r>
@@ -1231,7 +1231,7 @@
           </w:tcPr>
           <w:p>
             <w:pPr>
-              <w:spacing w:before="0" w:after="0"/>
+              <w:spacing w:before="0" w:after="0" w:line="240" w:lineRule="auto"/>
               <w:jc w:val="both"/>
             </w:pPr>
             <w:r>
@@ -1267,7 +1267,7 @@
           </w:tcPr>
           <w:p>
             <w:pPr>
-              <w:spacing w:before="0" w:after="0"/>
+              <w:spacing w:before="0" w:after="0" w:line="240" w:lineRule="auto"/>
               <w:jc w:val="center"/>
             </w:pPr>
             <w:r>
@@ -1298,7 +1298,7 @@
           </w:tcPr>
           <w:p>
             <w:pPr>
-              <w:spacing w:before="0" w:after="0"/>
+              <w:spacing w:before="0" w:after="0" w:line="240" w:lineRule="auto"/>
               <w:jc w:val="both"/>
             </w:pPr>
             <w:r>
@@ -1319,7 +1319,7 @@
     <w:p>
       <w:pPr>
         <w:pStyle w:val="Endure-ChapterBodyText"/>
-        <w:spacing w:before="100" w:after="100"/>
+        <w:spacing w:before="100" w:after="100" w:line="240" w:lineRule="auto"/>
       </w:pPr>
       <w:r>
         <w:rPr>
@@ -1332,7 +1332,7 @@
     <w:p>
       <w:pPr>
         <w:pStyle w:val="Endure-ChapterBodyText"/>
-        <w:spacing w:before="100" w:after="100"/>
+        <w:spacing w:before="100" w:after="100" w:line="240" w:lineRule="auto"/>
       </w:pPr>
       <w:r>
         <w:rPr>
@@ -1383,7 +1383,7 @@
     <w:p>
       <w:pPr>
         <w:pStyle w:val="Endure-ChapterBodyText"/>
-        <w:spacing w:before="100" w:after="100"/>
+        <w:spacing w:before="100" w:after="100" w:line="240" w:lineRule="auto"/>
       </w:pPr>
       <w:r>
         <w:rPr>
@@ -1396,7 +1396,7 @@
     <w:p>
       <w:pPr>
         <w:pStyle w:val="Endure-ChapterBodyText"/>
-        <w:spacing w:before="100" w:after="100"/>
+        <w:spacing w:before="100" w:after="100" w:line="240" w:lineRule="auto"/>
       </w:pPr>
       <w:r>
         <w:rPr>
@@ -1421,7 +1421,7 @@
     <w:p>
       <w:pPr>
         <w:pStyle w:val="Endure-ChapterBodyText"/>
-        <w:spacing w:before="100" w:after="100"/>
+        <w:spacing w:before="100" w:after="100" w:line="240" w:lineRule="auto"/>
       </w:pPr>
       <w:r>
         <w:rPr>
@@ -1433,7 +1433,7 @@
     <w:p>
       <w:pPr>
         <w:pStyle w:val="Endure-ChapterBodyText"/>
-        <w:spacing w:before="40" w:after="40"/>
+        <w:spacing w:before="40" w:after="40" w:line="240" w:lineRule="auto"/>
         <w:ind w:left="360" w:hanging="216"/>
       </w:pPr>
       <w:r>
@@ -1452,7 +1452,7 @@
     <w:p>
       <w:pPr>
         <w:pStyle w:val="Endure-ChapterBodyText"/>
-        <w:spacing w:before="40" w:after="40"/>
+        <w:spacing w:before="40" w:after="40" w:line="240" w:lineRule="auto"/>
         <w:ind w:left="360" w:hanging="216"/>
       </w:pPr>
       <w:r>
@@ -1471,7 +1471,7 @@
     <w:p>
       <w:pPr>
         <w:pStyle w:val="Endure-ChapterBodyText"/>
-        <w:spacing w:before="40" w:after="40"/>
+        <w:spacing w:before="40" w:after="40" w:line="240" w:lineRule="auto"/>
         <w:ind w:left="360" w:hanging="216"/>
       </w:pPr>
       <w:r>
@@ -1495,7 +1495,7 @@
     <w:p>
       <w:pPr>
         <w:pStyle w:val="Endure-ChapterBodyText"/>
-        <w:spacing w:before="100" w:after="100"/>
+        <w:spacing w:before="100" w:after="100" w:line="240" w:lineRule="auto"/>
       </w:pPr>
       <w:r>
         <w:rPr>
@@ -1507,7 +1507,7 @@
     <w:p>
       <w:pPr>
         <w:pStyle w:val="Endure-ChapterBodyText"/>
-        <w:spacing w:before="100" w:after="100"/>
+        <w:spacing w:before="100" w:after="100" w:line="240" w:lineRule="auto"/>
       </w:pPr>
       <w:r>
         <w:rPr>
@@ -1520,7 +1520,7 @@
     <w:p>
       <w:pPr>
         <w:pStyle w:val="Endure-ChapterBodyText"/>
-        <w:spacing w:before="100" w:after="100"/>
+        <w:spacing w:before="100" w:after="100" w:line="240" w:lineRule="auto"/>
       </w:pPr>
       <w:r>
         <w:rPr>
@@ -1532,7 +1532,7 @@
     <w:p>
       <w:pPr>
         <w:pStyle w:val="Endure-ChapterBodyText"/>
-        <w:spacing w:before="40" w:after="40"/>
+        <w:spacing w:before="40" w:after="40" w:line="240" w:lineRule="auto"/>
         <w:ind w:left="360" w:hanging="216"/>
       </w:pPr>
       <w:r>
@@ -1551,7 +1551,7 @@
     <w:p>
       <w:pPr>
         <w:pStyle w:val="Endure-ChapterBodyText"/>
-        <w:spacing w:before="40" w:after="40"/>
+        <w:spacing w:before="40" w:after="40" w:line="240" w:lineRule="auto"/>
         <w:ind w:left="360" w:hanging="216"/>
       </w:pPr>
       <w:r>
@@ -1570,7 +1570,7 @@
     <w:p>
       <w:pPr>
         <w:pStyle w:val="Endure-ChapterBodyText"/>
-        <w:spacing w:before="40" w:after="40"/>
+        <w:spacing w:before="40" w:after="40" w:line="240" w:lineRule="auto"/>
         <w:ind w:left="360" w:hanging="216"/>
       </w:pPr>
       <w:r>
@@ -1594,7 +1594,7 @@
     <w:p>
       <w:pPr>
         <w:pStyle w:val="Endure-ChapterBodyText"/>
-        <w:spacing w:before="100" w:after="100"/>
+        <w:spacing w:before="100" w:after="100" w:line="240" w:lineRule="auto"/>
       </w:pPr>
       <w:r>
         <w:rPr>
@@ -1607,20 +1607,20 @@
       <w:pPr>
         <w:pStyle w:val="Endure-Subhead"/>
         <w:keepNext/>
-        <w:spacing w:before="240" w:after="60"/>
+        <w:spacing w:before="240" w:after="60" w:line="240" w:lineRule="auto"/>
         <w:outlineLvl w:val="1"/>
       </w:pPr>
       <w:r>
         <w:rPr>
           <w:sz w:val="24"/>
         </w:rPr>
-        <w:t>0.1 ¿Qué es la NVIDIA Jetson AGX Orin 64GB?</w:t>
+        <w:t>1.1 ¿Qué es la NVIDIA Jetson AGX Orin 64GB?</w:t>
       </w:r>
     </w:p>
     <w:p>
       <w:pPr>
         <w:pStyle w:val="Endure-FirstParagraphBodyText"/>
-        <w:spacing w:before="100" w:after="100"/>
+        <w:spacing w:before="100" w:after="100" w:line="240" w:lineRule="auto"/>
       </w:pPr>
       <w:r>
         <w:rPr>
@@ -1632,7 +1632,7 @@
     <w:p>
       <w:pPr>
         <w:pStyle w:val="Endure-ChapterBodyText"/>
-        <w:spacing w:before="100" w:after="100"/>
+        <w:spacing w:before="100" w:after="100" w:line="240" w:lineRule="auto"/>
       </w:pPr>
       <w:r>
         <w:rPr>
@@ -2013,7 +2013,7 @@
       <w:pPr>
         <w:pStyle w:val="Endure-Subhead"/>
         <w:keepNext/>
-        <w:spacing w:before="160" w:after="60"/>
+        <w:spacing w:before="160" w:after="60" w:line="240" w:lineRule="auto"/>
         <w:outlineLvl w:val="2"/>
       </w:pPr>
       <w:r>
@@ -2026,7 +2026,7 @@
     <w:p>
       <w:pPr>
         <w:pStyle w:val="Endure-FirstParagraphBodyText"/>
-        <w:spacing w:before="100" w:after="100"/>
+        <w:spacing w:before="100" w:after="100" w:line="240" w:lineRule="auto"/>
       </w:pPr>
       <w:r>
         <w:rPr>
@@ -2038,7 +2038,7 @@
     <w:p>
       <w:pPr>
         <w:pStyle w:val="Endure-ChapterBodyText"/>
-        <w:spacing w:before="40" w:after="40"/>
+        <w:spacing w:before="40" w:after="40" w:line="240" w:lineRule="auto"/>
         <w:ind w:left="360" w:hanging="216"/>
       </w:pPr>
       <w:r>
@@ -2064,7 +2064,7 @@
     <w:p>
       <w:pPr>
         <w:pStyle w:val="Endure-ChapterBodyText"/>
-        <w:spacing w:before="40" w:after="40"/>
+        <w:spacing w:before="40" w:after="40" w:line="240" w:lineRule="auto"/>
         <w:ind w:left="360" w:hanging="216"/>
       </w:pPr>
       <w:r>
@@ -2096,21 +2096,21 @@
       <w:pPr>
         <w:pStyle w:val="Endure-Subhead"/>
         <w:keepNext/>
-        <w:spacing w:before="240" w:after="60"/>
+        <w:spacing w:before="240" w:after="60" w:line="240" w:lineRule="auto"/>
         <w:outlineLvl w:val="1"/>
       </w:pPr>
       <w:r>
         <w:rPr>
           <w:sz w:val="24"/>
         </w:rPr>
-        <w:t>0.2 Especificaciones Técnicas Completas</w:t>
+        <w:t>1.2 Especificaciones Técnicas Completas</w:t>
       </w:r>
     </w:p>
     <w:p>
       <w:pPr>
         <w:pStyle w:val="Endure-Subhead"/>
         <w:keepNext/>
-        <w:spacing w:before="160" w:after="60"/>
+        <w:spacing w:before="160" w:after="60" w:line="240" w:lineRule="auto"/>
         <w:outlineLvl w:val="2"/>
       </w:pPr>
       <w:r>
@@ -2155,7 +2155,7 @@
           </w:tcPr>
           <w:p>
             <w:pPr>
-              <w:spacing w:before="0" w:after="0"/>
+              <w:spacing w:before="0" w:after="0" w:line="240" w:lineRule="auto"/>
               <w:jc w:val="center"/>
             </w:pPr>
             <w:r>
@@ -2188,7 +2188,7 @@
           </w:tcPr>
           <w:p>
             <w:pPr>
-              <w:spacing w:before="0" w:after="0"/>
+              <w:spacing w:before="0" w:after="0" w:line="240" w:lineRule="auto"/>
               <w:jc w:val="center"/>
             </w:pPr>
             <w:r>
@@ -2226,7 +2226,7 @@
           </w:tcPr>
           <w:p>
             <w:pPr>
-              <w:spacing w:before="0" w:after="0"/>
+              <w:spacing w:before="0" w:after="0" w:line="240" w:lineRule="auto"/>
               <w:jc w:val="center"/>
             </w:pPr>
             <w:r>
@@ -2257,7 +2257,7 @@
           </w:tcPr>
           <w:p>
             <w:pPr>
-              <w:spacing w:before="0" w:after="0"/>
+              <w:spacing w:before="0" w:after="0" w:line="240" w:lineRule="auto"/>
               <w:jc w:val="both"/>
             </w:pPr>
             <w:r>
@@ -2293,7 +2293,7 @@
           </w:tcPr>
           <w:p>
             <w:pPr>
-              <w:spacing w:before="0" w:after="0"/>
+              <w:spacing w:before="0" w:after="0" w:line="240" w:lineRule="auto"/>
               <w:jc w:val="center"/>
             </w:pPr>
             <w:r>
@@ -2324,7 +2324,7 @@
           </w:tcPr>
           <w:p>
             <w:pPr>
-              <w:spacing w:before="0" w:after="0"/>
+              <w:spacing w:before="0" w:after="0" w:line="240" w:lineRule="auto"/>
               <w:jc w:val="both"/>
             </w:pPr>
             <w:r>
@@ -2360,7 +2360,7 @@
           </w:tcPr>
           <w:p>
             <w:pPr>
-              <w:spacing w:before="0" w:after="0"/>
+              <w:spacing w:before="0" w:after="0" w:line="240" w:lineRule="auto"/>
               <w:jc w:val="center"/>
             </w:pPr>
             <w:r>
@@ -2391,7 +2391,7 @@
           </w:tcPr>
           <w:p>
             <w:pPr>
-              <w:spacing w:before="0" w:after="0"/>
+              <w:spacing w:before="0" w:after="0" w:line="240" w:lineRule="auto"/>
               <w:jc w:val="center"/>
             </w:pPr>
             <w:r>
@@ -2427,7 +2427,7 @@
           </w:tcPr>
           <w:p>
             <w:pPr>
-              <w:spacing w:before="0" w:after="0"/>
+              <w:spacing w:before="0" w:after="0" w:line="240" w:lineRule="auto"/>
               <w:jc w:val="center"/>
             </w:pPr>
             <w:r>
@@ -2458,7 +2458,7 @@
           </w:tcPr>
           <w:p>
             <w:pPr>
-              <w:spacing w:before="0" w:after="0"/>
+              <w:spacing w:before="0" w:after="0" w:line="240" w:lineRule="auto"/>
               <w:jc w:val="center"/>
             </w:pPr>
             <w:r>
@@ -2494,7 +2494,7 @@
           </w:tcPr>
           <w:p>
             <w:pPr>
-              <w:spacing w:before="0" w:after="0"/>
+              <w:spacing w:before="0" w:after="0" w:line="240" w:lineRule="auto"/>
               <w:jc w:val="center"/>
             </w:pPr>
             <w:r>
@@ -2525,7 +2525,7 @@
           </w:tcPr>
           <w:p>
             <w:pPr>
-              <w:spacing w:before="0" w:after="0"/>
+              <w:spacing w:before="0" w:after="0" w:line="240" w:lineRule="auto"/>
               <w:jc w:val="both"/>
             </w:pPr>
             <w:r>
@@ -2561,7 +2561,7 @@
           </w:tcPr>
           <w:p>
             <w:pPr>
-              <w:spacing w:before="0" w:after="0"/>
+              <w:spacing w:before="0" w:after="0" w:line="240" w:lineRule="auto"/>
               <w:jc w:val="center"/>
             </w:pPr>
             <w:r>
@@ -2592,7 +2592,7 @@
           </w:tcPr>
           <w:p>
             <w:pPr>
-              <w:spacing w:before="0" w:after="0"/>
+              <w:spacing w:before="0" w:after="0" w:line="240" w:lineRule="auto"/>
               <w:jc w:val="both"/>
             </w:pPr>
             <w:r>
@@ -2628,7 +2628,7 @@
           </w:tcPr>
           <w:p>
             <w:pPr>
-              <w:spacing w:before="0" w:after="0"/>
+              <w:spacing w:before="0" w:after="0" w:line="240" w:lineRule="auto"/>
               <w:jc w:val="center"/>
             </w:pPr>
             <w:r>
@@ -2659,7 +2659,7 @@
           </w:tcPr>
           <w:p>
             <w:pPr>
-              <w:spacing w:before="0" w:after="0"/>
+              <w:spacing w:before="0" w:after="0" w:line="240" w:lineRule="auto"/>
               <w:jc w:val="center"/>
             </w:pPr>
             <w:r>
@@ -2695,7 +2695,7 @@
           </w:tcPr>
           <w:p>
             <w:pPr>
-              <w:spacing w:before="0" w:after="0"/>
+              <w:spacing w:before="0" w:after="0" w:line="240" w:lineRule="auto"/>
               <w:jc w:val="center"/>
             </w:pPr>
             <w:r>
@@ -2726,7 +2726,7 @@
           </w:tcPr>
           <w:p>
             <w:pPr>
-              <w:spacing w:before="0" w:after="0"/>
+              <w:spacing w:before="0" w:after="0" w:line="240" w:lineRule="auto"/>
               <w:jc w:val="center"/>
             </w:pPr>
             <w:r>
@@ -2762,7 +2762,7 @@
           </w:tcPr>
           <w:p>
             <w:pPr>
-              <w:spacing w:before="0" w:after="0"/>
+              <w:spacing w:before="0" w:after="0" w:line="240" w:lineRule="auto"/>
               <w:jc w:val="center"/>
             </w:pPr>
             <w:r>
@@ -2793,7 +2793,7 @@
           </w:tcPr>
           <w:p>
             <w:pPr>
-              <w:spacing w:before="0" w:after="0"/>
+              <w:spacing w:before="0" w:after="0" w:line="240" w:lineRule="auto"/>
               <w:jc w:val="center"/>
             </w:pPr>
             <w:r>
@@ -2829,7 +2829,7 @@
           </w:tcPr>
           <w:p>
             <w:pPr>
-              <w:spacing w:before="0" w:after="0"/>
+              <w:spacing w:before="0" w:after="0" w:line="240" w:lineRule="auto"/>
               <w:jc w:val="center"/>
             </w:pPr>
             <w:r>
@@ -2860,7 +2860,7 @@
           </w:tcPr>
           <w:p>
             <w:pPr>
-              <w:spacing w:before="0" w:after="0"/>
+              <w:spacing w:before="0" w:after="0" w:line="240" w:lineRule="auto"/>
               <w:jc w:val="both"/>
             </w:pPr>
             <w:r>
@@ -2896,7 +2896,7 @@
           </w:tcPr>
           <w:p>
             <w:pPr>
-              <w:spacing w:before="0" w:after="0"/>
+              <w:spacing w:before="0" w:after="0" w:line="240" w:lineRule="auto"/>
               <w:jc w:val="center"/>
             </w:pPr>
             <w:r>
@@ -2927,7 +2927,7 @@
           </w:tcPr>
           <w:p>
             <w:pPr>
-              <w:spacing w:before="0" w:after="0"/>
+              <w:spacing w:before="0" w:after="0" w:line="240" w:lineRule="auto"/>
               <w:jc w:val="both"/>
             </w:pPr>
             <w:r>
@@ -2963,7 +2963,7 @@
           </w:tcPr>
           <w:p>
             <w:pPr>
-              <w:spacing w:before="0" w:after="0"/>
+              <w:spacing w:before="0" w:after="0" w:line="240" w:lineRule="auto"/>
               <w:jc w:val="center"/>
             </w:pPr>
             <w:r>
@@ -2994,7 +2994,7 @@
           </w:tcPr>
           <w:p>
             <w:pPr>
-              <w:spacing w:before="0" w:after="0"/>
+              <w:spacing w:before="0" w:after="0" w:line="240" w:lineRule="auto"/>
               <w:jc w:val="center"/>
             </w:pPr>
             <w:r>
@@ -3030,7 +3030,7 @@
           </w:tcPr>
           <w:p>
             <w:pPr>
-              <w:spacing w:before="0" w:after="0"/>
+              <w:spacing w:before="0" w:after="0" w:line="240" w:lineRule="auto"/>
               <w:jc w:val="center"/>
             </w:pPr>
             <w:r>
@@ -3061,7 +3061,7 @@
           </w:tcPr>
           <w:p>
             <w:pPr>
-              <w:spacing w:before="0" w:after="0"/>
+              <w:spacing w:before="0" w:after="0" w:line="240" w:lineRule="auto"/>
               <w:jc w:val="center"/>
             </w:pPr>
             <w:r>
@@ -3097,7 +3097,7 @@
           </w:tcPr>
           <w:p>
             <w:pPr>
-              <w:spacing w:before="0" w:after="0"/>
+              <w:spacing w:before="0" w:after="0" w:line="240" w:lineRule="auto"/>
               <w:jc w:val="center"/>
             </w:pPr>
             <w:r>
@@ -3128,7 +3128,7 @@
           </w:tcPr>
           <w:p>
             <w:pPr>
-              <w:spacing w:before="0" w:after="0"/>
+              <w:spacing w:before="0" w:after="0" w:line="240" w:lineRule="auto"/>
               <w:jc w:val="both"/>
             </w:pPr>
             <w:r>
@@ -3164,7 +3164,7 @@
           </w:tcPr>
           <w:p>
             <w:pPr>
-              <w:spacing w:before="0" w:after="0"/>
+              <w:spacing w:before="0" w:after="0" w:line="240" w:lineRule="auto"/>
               <w:jc w:val="center"/>
             </w:pPr>
             <w:r>
@@ -3195,7 +3195,7 @@
           </w:tcPr>
           <w:p>
             <w:pPr>
-              <w:spacing w:before="0" w:after="0"/>
+              <w:spacing w:before="0" w:after="0" w:line="240" w:lineRule="auto"/>
               <w:jc w:val="both"/>
             </w:pPr>
             <w:r>
@@ -3231,7 +3231,7 @@
           </w:tcPr>
           <w:p>
             <w:pPr>
-              <w:spacing w:before="0" w:after="0"/>
+              <w:spacing w:before="0" w:after="0" w:line="240" w:lineRule="auto"/>
               <w:jc w:val="center"/>
             </w:pPr>
             <w:r>
@@ -3262,7 +3262,7 @@
           </w:tcPr>
           <w:p>
             <w:pPr>
-              <w:spacing w:before="0" w:after="0"/>
+              <w:spacing w:before="0" w:after="0" w:line="240" w:lineRule="auto"/>
               <w:jc w:val="center"/>
             </w:pPr>
             <w:r>
@@ -3284,7 +3284,7 @@
       <w:pPr>
         <w:pStyle w:val="Endure-Subhead"/>
         <w:keepNext/>
-        <w:spacing w:before="160" w:after="60"/>
+        <w:spacing w:before="160" w:after="60" w:line="240" w:lineRule="auto"/>
         <w:outlineLvl w:val="2"/>
       </w:pPr>
       <w:r>
@@ -3329,7 +3329,7 @@
           </w:tcPr>
           <w:p>
             <w:pPr>
-              <w:spacing w:before="0" w:after="0"/>
+              <w:spacing w:before="0" w:after="0" w:line="240" w:lineRule="auto"/>
               <w:jc w:val="center"/>
             </w:pPr>
             <w:r>
@@ -3362,7 +3362,7 @@
           </w:tcPr>
           <w:p>
             <w:pPr>
-              <w:spacing w:before="0" w:after="0"/>
+              <w:spacing w:before="0" w:after="0" w:line="240" w:lineRule="auto"/>
               <w:jc w:val="center"/>
             </w:pPr>
             <w:r>
@@ -3400,7 +3400,7 @@
           </w:tcPr>
           <w:p>
             <w:pPr>
-              <w:spacing w:before="0" w:after="0"/>
+              <w:spacing w:before="0" w:after="0" w:line="240" w:lineRule="auto"/>
               <w:jc w:val="center"/>
             </w:pPr>
             <w:r>
@@ -3431,7 +3431,7 @@
           </w:tcPr>
           <w:p>
             <w:pPr>
-              <w:spacing w:before="0" w:after="0"/>
+              <w:spacing w:before="0" w:after="0" w:line="240" w:lineRule="auto"/>
               <w:jc w:val="center"/>
             </w:pPr>
             <w:r>
@@ -3467,7 +3467,7 @@
           </w:tcPr>
           <w:p>
             <w:pPr>
-              <w:spacing w:before="0" w:after="0"/>
+              <w:spacing w:before="0" w:after="0" w:line="240" w:lineRule="auto"/>
               <w:jc w:val="center"/>
             </w:pPr>
             <w:r>
@@ -3498,7 +3498,7 @@
           </w:tcPr>
           <w:p>
             <w:pPr>
-              <w:spacing w:before="0" w:after="0"/>
+              <w:spacing w:before="0" w:after="0" w:line="240" w:lineRule="auto"/>
               <w:jc w:val="center"/>
             </w:pPr>
             <w:r>
@@ -3534,7 +3534,7 @@
           </w:tcPr>
           <w:p>
             <w:pPr>
-              <w:spacing w:before="0" w:after="0"/>
+              <w:spacing w:before="0" w:after="0" w:line="240" w:lineRule="auto"/>
               <w:jc w:val="center"/>
             </w:pPr>
             <w:r>
@@ -3565,7 +3565,7 @@
           </w:tcPr>
           <w:p>
             <w:pPr>
-              <w:spacing w:before="0" w:after="0"/>
+              <w:spacing w:before="0" w:after="0" w:line="240" w:lineRule="auto"/>
               <w:jc w:val="center"/>
             </w:pPr>
             <w:r>
@@ -3601,7 +3601,7 @@
           </w:tcPr>
           <w:p>
             <w:pPr>
-              <w:spacing w:before="0" w:after="0"/>
+              <w:spacing w:before="0" w:after="0" w:line="240" w:lineRule="auto"/>
               <w:jc w:val="center"/>
             </w:pPr>
             <w:r>
@@ -3632,7 +3632,7 @@
           </w:tcPr>
           <w:p>
             <w:pPr>
-              <w:spacing w:before="0" w:after="0"/>
+              <w:spacing w:before="0" w:after="0" w:line="240" w:lineRule="auto"/>
               <w:jc w:val="center"/>
             </w:pPr>
             <w:r>
@@ -3668,7 +3668,7 @@
           </w:tcPr>
           <w:p>
             <w:pPr>
-              <w:spacing w:before="0" w:after="0"/>
+              <w:spacing w:before="0" w:after="0" w:line="240" w:lineRule="auto"/>
               <w:jc w:val="center"/>
             </w:pPr>
             <w:r>
@@ -3699,7 +3699,7 @@
           </w:tcPr>
           <w:p>
             <w:pPr>
-              <w:spacing w:before="0" w:after="0"/>
+              <w:spacing w:before="0" w:after="0" w:line="240" w:lineRule="auto"/>
               <w:jc w:val="center"/>
             </w:pPr>
             <w:r>
@@ -3735,7 +3735,7 @@
           </w:tcPr>
           <w:p>
             <w:pPr>
-              <w:spacing w:before="0" w:after="0"/>
+              <w:spacing w:before="0" w:after="0" w:line="240" w:lineRule="auto"/>
               <w:jc w:val="center"/>
             </w:pPr>
             <w:r>
@@ -3766,7 +3766,7 @@
           </w:tcPr>
           <w:p>
             <w:pPr>
-              <w:spacing w:before="0" w:after="0"/>
+              <w:spacing w:before="0" w:after="0" w:line="240" w:lineRule="auto"/>
               <w:jc w:val="center"/>
             </w:pPr>
             <w:r>
@@ -3802,7 +3802,7 @@
           </w:tcPr>
           <w:p>
             <w:pPr>
-              <w:spacing w:before="0" w:after="0"/>
+              <w:spacing w:before="0" w:after="0" w:line="240" w:lineRule="auto"/>
               <w:jc w:val="center"/>
             </w:pPr>
             <w:r>
@@ -3833,7 +3833,7 @@
           </w:tcPr>
           <w:p>
             <w:pPr>
-              <w:spacing w:before="0" w:after="0"/>
+              <w:spacing w:before="0" w:after="0" w:line="240" w:lineRule="auto"/>
               <w:jc w:val="center"/>
             </w:pPr>
             <w:r>
@@ -3869,7 +3869,7 @@
           </w:tcPr>
           <w:p>
             <w:pPr>
-              <w:spacing w:before="0" w:after="0"/>
+              <w:spacing w:before="0" w:after="0" w:line="240" w:lineRule="auto"/>
               <w:jc w:val="center"/>
             </w:pPr>
             <w:r>
@@ -3900,7 +3900,7 @@
           </w:tcPr>
           <w:p>
             <w:pPr>
-              <w:spacing w:before="0" w:after="0"/>
+              <w:spacing w:before="0" w:after="0" w:line="240" w:lineRule="auto"/>
               <w:jc w:val="center"/>
             </w:pPr>
             <w:r>
@@ -3936,7 +3936,7 @@
           </w:tcPr>
           <w:p>
             <w:pPr>
-              <w:spacing w:before="0" w:after="0"/>
+              <w:spacing w:before="0" w:after="0" w:line="240" w:lineRule="auto"/>
               <w:jc w:val="center"/>
             </w:pPr>
             <w:r>
@@ -3967,7 +3967,7 @@
           </w:tcPr>
           <w:p>
             <w:pPr>
-              <w:spacing w:before="0" w:after="0"/>
+              <w:spacing w:before="0" w:after="0" w:line="240" w:lineRule="auto"/>
               <w:jc w:val="center"/>
             </w:pPr>
             <w:r>
@@ -4003,7 +4003,7 @@
           </w:tcPr>
           <w:p>
             <w:pPr>
-              <w:spacing w:before="0" w:after="0"/>
+              <w:spacing w:before="0" w:after="0" w:line="240" w:lineRule="auto"/>
               <w:jc w:val="center"/>
             </w:pPr>
             <w:r>
@@ -4034,7 +4034,7 @@
           </w:tcPr>
           <w:p>
             <w:pPr>
-              <w:spacing w:before="0" w:after="0"/>
+              <w:spacing w:before="0" w:after="0" w:line="240" w:lineRule="auto"/>
               <w:jc w:val="center"/>
             </w:pPr>
             <w:r>
@@ -4070,7 +4070,7 @@
           </w:tcPr>
           <w:p>
             <w:pPr>
-              <w:spacing w:before="0" w:after="0"/>
+              <w:spacing w:before="0" w:after="0" w:line="240" w:lineRule="auto"/>
               <w:jc w:val="center"/>
             </w:pPr>
             <w:r>
@@ -4101,7 +4101,7 @@
           </w:tcPr>
           <w:p>
             <w:pPr>
-              <w:spacing w:before="0" w:after="0"/>
+              <w:spacing w:before="0" w:after="0" w:line="240" w:lineRule="auto"/>
               <w:jc w:val="center"/>
             </w:pPr>
             <w:r>
@@ -4255,20 +4255,20 @@
       <w:pPr>
         <w:pStyle w:val="Endure-Subhead"/>
         <w:keepNext/>
-        <w:spacing w:before="240" w:after="60"/>
+        <w:spacing w:before="240" w:after="60" w:line="240" w:lineRule="auto"/>
         <w:outlineLvl w:val="1"/>
       </w:pPr>
       <w:r>
         <w:rPr>
           <w:sz w:val="24"/>
         </w:rPr>
-        <w:t>0.3 JetPack 7.2 vs JetPack 6.2 — Qué Cambió</w:t>
+        <w:t>1.3 JetPack 7.2 vs JetPack 6.2 — Qué Cambió</w:t>
       </w:r>
     </w:p>
     <w:p>
       <w:pPr>
         <w:pStyle w:val="Endure-FirstParagraphBodyText"/>
-        <w:spacing w:before="100" w:after="100"/>
+        <w:spacing w:before="100" w:after="100" w:line="240" w:lineRule="auto"/>
       </w:pPr>
       <w:r>
         <w:rPr>
@@ -4314,7 +4314,7 @@
           </w:tcPr>
           <w:p>
             <w:pPr>
-              <w:spacing w:before="0" w:after="0"/>
+              <w:spacing w:before="0" w:after="0" w:line="240" w:lineRule="auto"/>
               <w:jc w:val="center"/>
             </w:pPr>
             <w:r>
@@ -4347,7 +4347,7 @@
           </w:tcPr>
           <w:p>
             <w:pPr>
-              <w:spacing w:before="0" w:after="0"/>
+              <w:spacing w:before="0" w:after="0" w:line="240" w:lineRule="auto"/>
               <w:jc w:val="center"/>
             </w:pPr>
             <w:r>
@@ -4380,7 +4380,7 @@
           </w:tcPr>
           <w:p>
             <w:pPr>
-              <w:spacing w:before="0" w:after="0"/>
+              <w:spacing w:before="0" w:after="0" w:line="240" w:lineRule="auto"/>
               <w:jc w:val="center"/>
             </w:pPr>
             <w:r>
@@ -4413,7 +4413,7 @@
           </w:tcPr>
           <w:p>
             <w:pPr>
-              <w:spacing w:before="0" w:after="0"/>
+              <w:spacing w:before="0" w:after="0" w:line="240" w:lineRule="auto"/>
               <w:jc w:val="center"/>
             </w:pPr>
             <w:r>
@@ -4451,7 +4451,7 @@
           </w:tcPr>
           <w:p>
             <w:pPr>
-              <w:spacing w:before="0" w:after="0"/>
+              <w:spacing w:before="0" w:after="0" w:line="240" w:lineRule="auto"/>
               <w:jc w:val="center"/>
             </w:pPr>
             <w:r>
@@ -4482,7 +4482,7 @@
           </w:tcPr>
           <w:p>
             <w:pPr>
-              <w:spacing w:before="0" w:after="0"/>
+              <w:spacing w:before="0" w:after="0" w:line="240" w:lineRule="auto"/>
               <w:jc w:val="center"/>
             </w:pPr>
             <w:r>
@@ -4513,7 +4513,7 @@
           </w:tcPr>
           <w:p>
             <w:pPr>
-              <w:spacing w:before="0" w:after="0"/>
+              <w:spacing w:before="0" w:after="0" w:line="240" w:lineRule="auto"/>
               <w:jc w:val="center"/>
             </w:pPr>
             <w:r>
@@ -4544,7 +4544,7 @@
           </w:tcPr>
           <w:p>
             <w:pPr>
-              <w:spacing w:before="0" w:after="0"/>
+              <w:spacing w:before="0" w:after="0" w:line="240" w:lineRule="auto"/>
               <w:jc w:val="both"/>
             </w:pPr>
             <w:r>
@@ -4580,7 +4580,7 @@
           </w:tcPr>
           <w:p>
             <w:pPr>
-              <w:spacing w:before="0" w:after="0"/>
+              <w:spacing w:before="0" w:after="0" w:line="240" w:lineRule="auto"/>
               <w:jc w:val="center"/>
             </w:pPr>
             <w:r>
@@ -4611,7 +4611,7 @@
           </w:tcPr>
           <w:p>
             <w:pPr>
-              <w:spacing w:before="0" w:after="0"/>
+              <w:spacing w:before="0" w:after="0" w:line="240" w:lineRule="auto"/>
               <w:jc w:val="center"/>
             </w:pPr>
             <w:r>
@@ -4642,7 +4642,7 @@
           </w:tcPr>
           <w:p>
             <w:pPr>
-              <w:spacing w:before="0" w:after="0"/>
+              <w:spacing w:before="0" w:after="0" w:line="240" w:lineRule="auto"/>
               <w:jc w:val="center"/>
             </w:pPr>
             <w:r>
@@ -4673,7 +4673,7 @@
           </w:tcPr>
           <w:p>
             <w:pPr>
-              <w:spacing w:before="0" w:after="0"/>
+              <w:spacing w:before="0" w:after="0" w:line="240" w:lineRule="auto"/>
               <w:jc w:val="center"/>
             </w:pPr>
             <w:r>
@@ -4709,7 +4709,7 @@
           </w:tcPr>
           <w:p>
             <w:pPr>
-              <w:spacing w:before="0" w:after="0"/>
+              <w:spacing w:before="0" w:after="0" w:line="240" w:lineRule="auto"/>
               <w:jc w:val="center"/>
             </w:pPr>
             <w:r>
@@ -4740,7 +4740,7 @@
           </w:tcPr>
           <w:p>
             <w:pPr>
-              <w:spacing w:before="0" w:after="0"/>
+              <w:spacing w:before="0" w:after="0" w:line="240" w:lineRule="auto"/>
               <w:jc w:val="center"/>
             </w:pPr>
             <w:r>
@@ -4771,7 +4771,7 @@
           </w:tcPr>
           <w:p>
             <w:pPr>
-              <w:spacing w:before="0" w:after="0"/>
+              <w:spacing w:before="0" w:after="0" w:line="240" w:lineRule="auto"/>
               <w:jc w:val="center"/>
             </w:pPr>
             <w:r>
@@ -4802,7 +4802,7 @@
           </w:tcPr>
           <w:p>
             <w:pPr>
-              <w:spacing w:before="0" w:after="0"/>
+              <w:spacing w:before="0" w:after="0" w:line="240" w:lineRule="auto"/>
               <w:jc w:val="center"/>
             </w:pPr>
             <w:r>
@@ -4838,7 +4838,7 @@
           </w:tcPr>
           <w:p>
             <w:pPr>
-              <w:spacing w:before="0" w:after="0"/>
+              <w:spacing w:before="0" w:after="0" w:line="240" w:lineRule="auto"/>
               <w:jc w:val="center"/>
             </w:pPr>
             <w:r>
@@ -4869,7 +4869,7 @@
           </w:tcPr>
           <w:p>
             <w:pPr>
-              <w:spacing w:before="0" w:after="0"/>
+              <w:spacing w:before="0" w:after="0" w:line="240" w:lineRule="auto"/>
               <w:jc w:val="center"/>
             </w:pPr>
             <w:r>
@@ -4900,7 +4900,7 @@
           </w:tcPr>
           <w:p>
             <w:pPr>
-              <w:spacing w:before="0" w:after="0"/>
+              <w:spacing w:before="0" w:after="0" w:line="240" w:lineRule="auto"/>
               <w:jc w:val="center"/>
             </w:pPr>
             <w:r>
@@ -4931,7 +4931,7 @@
           </w:tcPr>
           <w:p>
             <w:pPr>
-              <w:spacing w:before="0" w:after="0"/>
+              <w:spacing w:before="0" w:after="0" w:line="240" w:lineRule="auto"/>
               <w:jc w:val="both"/>
             </w:pPr>
             <w:r>
@@ -4967,7 +4967,7 @@
           </w:tcPr>
           <w:p>
             <w:pPr>
-              <w:spacing w:before="0" w:after="0"/>
+              <w:spacing w:before="0" w:after="0" w:line="240" w:lineRule="auto"/>
               <w:jc w:val="center"/>
             </w:pPr>
             <w:r>
@@ -4998,7 +4998,7 @@
           </w:tcPr>
           <w:p>
             <w:pPr>
-              <w:spacing w:before="0" w:after="0"/>
+              <w:spacing w:before="0" w:after="0" w:line="240" w:lineRule="auto"/>
               <w:jc w:val="center"/>
             </w:pPr>
             <w:r>
@@ -5029,7 +5029,7 @@
           </w:tcPr>
           <w:p>
             <w:pPr>
-              <w:spacing w:before="0" w:after="0"/>
+              <w:spacing w:before="0" w:after="0" w:line="240" w:lineRule="auto"/>
               <w:jc w:val="center"/>
             </w:pPr>
             <w:r>
@@ -5060,7 +5060,7 @@
           </w:tcPr>
           <w:p>
             <w:pPr>
-              <w:spacing w:before="0" w:after="0"/>
+              <w:spacing w:before="0" w:after="0" w:line="240" w:lineRule="auto"/>
               <w:jc w:val="center"/>
             </w:pPr>
             <w:r>
@@ -5096,7 +5096,7 @@
           </w:tcPr>
           <w:p>
             <w:pPr>
-              <w:spacing w:before="0" w:after="0"/>
+              <w:spacing w:before="0" w:after="0" w:line="240" w:lineRule="auto"/>
               <w:jc w:val="center"/>
             </w:pPr>
             <w:r>
@@ -5127,7 +5127,7 @@
           </w:tcPr>
           <w:p>
             <w:pPr>
-              <w:spacing w:before="0" w:after="0"/>
+              <w:spacing w:before="0" w:after="0" w:line="240" w:lineRule="auto"/>
               <w:jc w:val="center"/>
             </w:pPr>
             <w:r>
@@ -5158,7 +5158,7 @@
           </w:tcPr>
           <w:p>
             <w:pPr>
-              <w:spacing w:before="0" w:after="0"/>
+              <w:spacing w:before="0" w:after="0" w:line="240" w:lineRule="auto"/>
               <w:jc w:val="center"/>
             </w:pPr>
             <w:r>
@@ -5189,7 +5189,7 @@
           </w:tcPr>
           <w:p>
             <w:pPr>
-              <w:spacing w:before="0" w:after="0"/>
+              <w:spacing w:before="0" w:after="0" w:line="240" w:lineRule="auto"/>
               <w:jc w:val="both"/>
             </w:pPr>
             <w:r>
@@ -5225,7 +5225,7 @@
           </w:tcPr>
           <w:p>
             <w:pPr>
-              <w:spacing w:before="0" w:after="0"/>
+              <w:spacing w:before="0" w:after="0" w:line="240" w:lineRule="auto"/>
               <w:jc w:val="center"/>
             </w:pPr>
             <w:r>
@@ -5256,7 +5256,7 @@
           </w:tcPr>
           <w:p>
             <w:pPr>
-              <w:spacing w:before="0" w:after="0"/>
+              <w:spacing w:before="0" w:after="0" w:line="240" w:lineRule="auto"/>
               <w:jc w:val="center"/>
             </w:pPr>
             <w:r>
@@ -5287,7 +5287,7 @@
           </w:tcPr>
           <w:p>
             <w:pPr>
-              <w:spacing w:before="0" w:after="0"/>
+              <w:spacing w:before="0" w:after="0" w:line="240" w:lineRule="auto"/>
               <w:jc w:val="center"/>
             </w:pPr>
             <w:r>
@@ -5318,7 +5318,7 @@
           </w:tcPr>
           <w:p>
             <w:pPr>
-              <w:spacing w:before="0" w:after="0"/>
+              <w:spacing w:before="0" w:after="0" w:line="240" w:lineRule="auto"/>
               <w:jc w:val="center"/>
             </w:pPr>
             <w:r>
@@ -5354,7 +5354,7 @@
           </w:tcPr>
           <w:p>
             <w:pPr>
-              <w:spacing w:before="0" w:after="0"/>
+              <w:spacing w:before="0" w:after="0" w:line="240" w:lineRule="auto"/>
               <w:jc w:val="center"/>
             </w:pPr>
             <w:r>
@@ -5385,7 +5385,7 @@
           </w:tcPr>
           <w:p>
             <w:pPr>
-              <w:spacing w:before="0" w:after="0"/>
+              <w:spacing w:before="0" w:after="0" w:line="240" w:lineRule="auto"/>
               <w:jc w:val="center"/>
             </w:pPr>
             <w:r>
@@ -5416,7 +5416,7 @@
           </w:tcPr>
           <w:p>
             <w:pPr>
-              <w:spacing w:before="0" w:after="0"/>
+              <w:spacing w:before="0" w:after="0" w:line="240" w:lineRule="auto"/>
               <w:jc w:val="center"/>
             </w:pPr>
             <w:r>
@@ -5447,7 +5447,7 @@
           </w:tcPr>
           <w:p>
             <w:pPr>
-              <w:spacing w:before="0" w:after="0"/>
+              <w:spacing w:before="0" w:after="0" w:line="240" w:lineRule="auto"/>
               <w:jc w:val="center"/>
             </w:pPr>
             <w:r>
@@ -5483,7 +5483,7 @@
           </w:tcPr>
           <w:p>
             <w:pPr>
-              <w:spacing w:before="0" w:after="0"/>
+              <w:spacing w:before="0" w:after="0" w:line="240" w:lineRule="auto"/>
               <w:jc w:val="center"/>
             </w:pPr>
             <w:r>
@@ -5514,7 +5514,7 @@
           </w:tcPr>
           <w:p>
             <w:pPr>
-              <w:spacing w:before="0" w:after="0"/>
+              <w:spacing w:before="0" w:after="0" w:line="240" w:lineRule="auto"/>
               <w:jc w:val="center"/>
             </w:pPr>
             <w:r>
@@ -5545,7 +5545,7 @@
           </w:tcPr>
           <w:p>
             <w:pPr>
-              <w:spacing w:before="0" w:after="0"/>
+              <w:spacing w:before="0" w:after="0" w:line="240" w:lineRule="auto"/>
               <w:jc w:val="center"/>
             </w:pPr>
             <w:r>
@@ -5576,7 +5576,7 @@
           </w:tcPr>
           <w:p>
             <w:pPr>
-              <w:spacing w:before="0" w:after="0"/>
+              <w:spacing w:before="0" w:after="0" w:line="240" w:lineRule="auto"/>
               <w:jc w:val="center"/>
             </w:pPr>
             <w:r>
@@ -5612,7 +5612,7 @@
           </w:tcPr>
           <w:p>
             <w:pPr>
-              <w:spacing w:before="0" w:after="0"/>
+              <w:spacing w:before="0" w:after="0" w:line="240" w:lineRule="auto"/>
               <w:jc w:val="center"/>
             </w:pPr>
             <w:r>
@@ -5643,7 +5643,7 @@
           </w:tcPr>
           <w:p>
             <w:pPr>
-              <w:spacing w:before="0" w:after="0"/>
+              <w:spacing w:before="0" w:after="0" w:line="240" w:lineRule="auto"/>
               <w:jc w:val="center"/>
             </w:pPr>
             <w:r>
@@ -5674,7 +5674,7 @@
           </w:tcPr>
           <w:p>
             <w:pPr>
-              <w:spacing w:before="0" w:after="0"/>
+              <w:spacing w:before="0" w:after="0" w:line="240" w:lineRule="auto"/>
               <w:jc w:val="center"/>
             </w:pPr>
             <w:r>
@@ -5705,7 +5705,7 @@
           </w:tcPr>
           <w:p>
             <w:pPr>
-              <w:spacing w:before="0" w:after="0"/>
+              <w:spacing w:before="0" w:after="0" w:line="240" w:lineRule="auto"/>
               <w:jc w:val="both"/>
             </w:pPr>
             <w:r>
@@ -5726,7 +5726,7 @@
     <w:p>
       <w:pPr>
         <w:pStyle w:val="Endure-ChapterBodyText"/>
-        <w:spacing w:before="100" w:after="100"/>
+        <w:spacing w:before="100" w:after="100" w:line="240" w:lineRule="auto"/>
       </w:pPr>
       <w:r>
         <w:rPr>
@@ -5746,14 +5746,14 @@
       <w:pPr>
         <w:pStyle w:val="Endure-Subhead"/>
         <w:keepNext/>
-        <w:spacing w:before="240" w:after="60"/>
+        <w:spacing w:before="240" w:after="60" w:line="240" w:lineRule="auto"/>
         <w:outlineLvl w:val="1"/>
       </w:pPr>
       <w:r>
         <w:rPr>
           <w:sz w:val="24"/>
         </w:rPr>
-        <w:t>0.4 Arquitectura del Sistema al Final de Este Libro</w:t>
+        <w:t>1.4 Arquitectura del Sistema al Final de Este Libro</w:t>
       </w:r>
     </w:p>
     <w:p>
@@ -5776,7 +5776,7 @@
                     <pic:cNvPicPr/>
                   </pic:nvPicPr>
                   <pic:blipFill>
-                    <a:blip r:embed="rId46"/>
+                    <a:blip r:embed="rId51"/>
                     <a:stretch>
                       <a:fillRect/>
                     </a:stretch>
@@ -5798,7 +5798,7 @@
     <w:p>
       <w:pPr>
         <w:pStyle w:val="Endure-CopyrightPage"/>
-        <w:spacing w:before="40" w:after="160"/>
+        <w:spacing w:before="40" w:after="160" w:line="240" w:lineRule="auto"/>
         <w:jc w:val="center"/>
       </w:pPr>
       <w:r>
@@ -5812,7 +5812,7 @@
     <w:p>
       <w:pPr>
         <w:pStyle w:val="Endure-ChapterBodyText"/>
-        <w:spacing w:before="100" w:after="100"/>
+        <w:spacing w:before="100" w:after="100" w:line="240" w:lineRule="auto"/>
       </w:pPr>
       <w:r>
         <w:rPr>
@@ -6384,20 +6384,20 @@
       <w:pPr>
         <w:pStyle w:val="Endure-Subhead"/>
         <w:keepNext/>
-        <w:spacing w:before="240" w:after="60"/>
+        <w:spacing w:before="240" w:after="60" w:line="240" w:lineRule="auto"/>
         <w:outlineLvl w:val="1"/>
       </w:pPr>
       <w:r>
         <w:rPr>
           <w:sz w:val="24"/>
         </w:rPr>
-        <w:t>0.5 Material Necesario</w:t>
+        <w:t>1.5 Material Necesario</w:t>
       </w:r>
     </w:p>
     <w:p>
       <w:pPr>
         <w:pStyle w:val="Endure-FirstParagraphBodyText"/>
-        <w:spacing w:before="100" w:after="100"/>
+        <w:spacing w:before="100" w:after="100" w:line="240" w:lineRule="auto"/>
       </w:pPr>
       <w:r>
         <w:rPr>
@@ -6410,7 +6410,7 @@
       <w:pPr>
         <w:pStyle w:val="Endure-Subhead"/>
         <w:keepNext/>
-        <w:spacing w:before="160" w:after="60"/>
+        <w:spacing w:before="160" w:after="60" w:line="240" w:lineRule="auto"/>
         <w:outlineLvl w:val="2"/>
       </w:pPr>
       <w:r>
@@ -6455,7 +6455,7 @@
           </w:tcPr>
           <w:p>
             <w:pPr>
-              <w:spacing w:before="0" w:after="0"/>
+              <w:spacing w:before="0" w:after="0" w:line="240" w:lineRule="auto"/>
               <w:jc w:val="center"/>
             </w:pPr>
             <w:r>
@@ -6488,7 +6488,7 @@
           </w:tcPr>
           <w:p>
             <w:pPr>
-              <w:spacing w:before="0" w:after="0"/>
+              <w:spacing w:before="0" w:after="0" w:line="240" w:lineRule="auto"/>
               <w:jc w:val="center"/>
             </w:pPr>
             <w:r>
@@ -6526,7 +6526,7 @@
           </w:tcPr>
           <w:p>
             <w:pPr>
-              <w:spacing w:before="0" w:after="0"/>
+              <w:spacing w:before="0" w:after="0" w:line="240" w:lineRule="auto"/>
               <w:jc w:val="both"/>
             </w:pPr>
             <w:r>
@@ -6557,7 +6557,7 @@
           </w:tcPr>
           <w:p>
             <w:pPr>
-              <w:spacing w:before="0" w:after="0"/>
+              <w:spacing w:before="0" w:after="0" w:line="240" w:lineRule="auto"/>
               <w:jc w:val="center"/>
             </w:pPr>
             <w:r>
@@ -6593,7 +6593,7 @@
           </w:tcPr>
           <w:p>
             <w:pPr>
-              <w:spacing w:before="0" w:after="0"/>
+              <w:spacing w:before="0" w:after="0" w:line="240" w:lineRule="auto"/>
               <w:jc w:val="center"/>
             </w:pPr>
             <w:r>
@@ -6624,7 +6624,7 @@
           </w:tcPr>
           <w:p>
             <w:pPr>
-              <w:spacing w:before="0" w:after="0"/>
+              <w:spacing w:before="0" w:after="0" w:line="240" w:lineRule="auto"/>
               <w:jc w:val="both"/>
             </w:pPr>
             <w:r>
@@ -6660,7 +6660,7 @@
           </w:tcPr>
           <w:p>
             <w:pPr>
-              <w:spacing w:before="0" w:after="0"/>
+              <w:spacing w:before="0" w:after="0" w:line="240" w:lineRule="auto"/>
               <w:jc w:val="center"/>
             </w:pPr>
             <w:r>
@@ -6691,7 +6691,7 @@
           </w:tcPr>
           <w:p>
             <w:pPr>
-              <w:spacing w:before="0" w:after="0"/>
+              <w:spacing w:before="0" w:after="0" w:line="240" w:lineRule="auto"/>
               <w:jc w:val="both"/>
             </w:pPr>
             <w:r>
@@ -6727,7 +6727,7 @@
           </w:tcPr>
           <w:p>
             <w:pPr>
-              <w:spacing w:before="0" w:after="0"/>
+              <w:spacing w:before="0" w:after="0" w:line="240" w:lineRule="auto"/>
               <w:jc w:val="center"/>
             </w:pPr>
             <w:r>
@@ -6758,7 +6758,7 @@
           </w:tcPr>
           <w:p>
             <w:pPr>
-              <w:spacing w:before="0" w:after="0"/>
+              <w:spacing w:before="0" w:after="0" w:line="240" w:lineRule="auto"/>
               <w:jc w:val="both"/>
             </w:pPr>
             <w:r>
@@ -6794,7 +6794,7 @@
           </w:tcPr>
           <w:p>
             <w:pPr>
-              <w:spacing w:before="0" w:after="0"/>
+              <w:spacing w:before="0" w:after="0" w:line="240" w:lineRule="auto"/>
               <w:jc w:val="center"/>
             </w:pPr>
             <w:r>
@@ -6825,7 +6825,7 @@
           </w:tcPr>
           <w:p>
             <w:pPr>
-              <w:spacing w:before="0" w:after="0"/>
+              <w:spacing w:before="0" w:after="0" w:line="240" w:lineRule="auto"/>
               <w:jc w:val="both"/>
             </w:pPr>
             <w:r>
@@ -6847,7 +6847,7 @@
       <w:pPr>
         <w:pStyle w:val="Endure-Subhead"/>
         <w:keepNext/>
-        <w:spacing w:before="160" w:after="60"/>
+        <w:spacing w:before="160" w:after="60" w:line="240" w:lineRule="auto"/>
         <w:outlineLvl w:val="2"/>
       </w:pPr>
       <w:r>
@@ -6892,7 +6892,7 @@
           </w:tcPr>
           <w:p>
             <w:pPr>
-              <w:spacing w:before="0" w:after="0"/>
+              <w:spacing w:before="0" w:after="0" w:line="240" w:lineRule="auto"/>
               <w:jc w:val="center"/>
             </w:pPr>
             <w:r>
@@ -6925,7 +6925,7 @@
           </w:tcPr>
           <w:p>
             <w:pPr>
-              <w:spacing w:before="0" w:after="0"/>
+              <w:spacing w:before="0" w:after="0" w:line="240" w:lineRule="auto"/>
               <w:jc w:val="center"/>
             </w:pPr>
             <w:r>
@@ -6963,7 +6963,7 @@
           </w:tcPr>
           <w:p>
             <w:pPr>
-              <w:spacing w:before="0" w:after="0"/>
+              <w:spacing w:before="0" w:after="0" w:line="240" w:lineRule="auto"/>
               <w:jc w:val="both"/>
             </w:pPr>
             <w:r>
@@ -6994,7 +6994,7 @@
           </w:tcPr>
           <w:p>
             <w:pPr>
-              <w:spacing w:before="0" w:after="0"/>
+              <w:spacing w:before="0" w:after="0" w:line="240" w:lineRule="auto"/>
               <w:jc w:val="center"/>
             </w:pPr>
             <w:r>
@@ -7030,7 +7030,7 @@
           </w:tcPr>
           <w:p>
             <w:pPr>
-              <w:spacing w:before="0" w:after="0"/>
+              <w:spacing w:before="0" w:after="0" w:line="240" w:lineRule="auto"/>
               <w:jc w:val="both"/>
             </w:pPr>
             <w:r>
@@ -7061,7 +7061,7 @@
           </w:tcPr>
           <w:p>
             <w:pPr>
-              <w:spacing w:before="0" w:after="0"/>
+              <w:spacing w:before="0" w:after="0" w:line="240" w:lineRule="auto"/>
               <w:jc w:val="both"/>
             </w:pPr>
             <w:r>
@@ -7097,7 +7097,7 @@
           </w:tcPr>
           <w:p>
             <w:pPr>
-              <w:spacing w:before="0" w:after="0"/>
+              <w:spacing w:before="0" w:after="0" w:line="240" w:lineRule="auto"/>
               <w:jc w:val="center"/>
             </w:pPr>
             <w:r>
@@ -7128,7 +7128,7 @@
           </w:tcPr>
           <w:p>
             <w:pPr>
-              <w:spacing w:before="0" w:after="0"/>
+              <w:spacing w:before="0" w:after="0" w:line="240" w:lineRule="auto"/>
               <w:jc w:val="center"/>
             </w:pPr>
             <w:r>
@@ -7164,7 +7164,7 @@
           </w:tcPr>
           <w:p>
             <w:pPr>
-              <w:spacing w:before="0" w:after="0"/>
+              <w:spacing w:before="0" w:after="0" w:line="240" w:lineRule="auto"/>
               <w:jc w:val="both"/>
             </w:pPr>
             <w:r>
@@ -7195,7 +7195,7 @@
           </w:tcPr>
           <w:p>
             <w:pPr>
-              <w:spacing w:before="0" w:after="0"/>
+              <w:spacing w:before="0" w:after="0" w:line="240" w:lineRule="auto"/>
               <w:jc w:val="center"/>
             </w:pPr>
             <w:r>
@@ -7217,7 +7217,7 @@
       <w:pPr>
         <w:pStyle w:val="Endure-Subhead"/>
         <w:keepNext/>
-        <w:spacing w:before="160" w:after="60"/>
+        <w:spacing w:before="160" w:after="60" w:line="240" w:lineRule="auto"/>
         <w:outlineLvl w:val="2"/>
       </w:pPr>
       <w:r>
@@ -7262,7 +7262,7 @@
           </w:tcPr>
           <w:p>
             <w:pPr>
-              <w:spacing w:before="0" w:after="0"/>
+              <w:spacing w:before="0" w:after="0" w:line="240" w:lineRule="auto"/>
               <w:jc w:val="center"/>
             </w:pPr>
             <w:r>
@@ -7295,7 +7295,7 @@
           </w:tcPr>
           <w:p>
             <w:pPr>
-              <w:spacing w:before="0" w:after="0"/>
+              <w:spacing w:before="0" w:after="0" w:line="240" w:lineRule="auto"/>
               <w:jc w:val="center"/>
             </w:pPr>
             <w:r>
@@ -7333,7 +7333,7 @@
           </w:tcPr>
           <w:p>
             <w:pPr>
-              <w:spacing w:before="0" w:after="0"/>
+              <w:spacing w:before="0" w:after="0" w:line="240" w:lineRule="auto"/>
               <w:jc w:val="both"/>
             </w:pPr>
             <w:r>
@@ -7364,7 +7364,7 @@
           </w:tcPr>
           <w:p>
             <w:pPr>
-              <w:spacing w:before="0" w:after="0"/>
+              <w:spacing w:before="0" w:after="0" w:line="240" w:lineRule="auto"/>
               <w:jc w:val="both"/>
             </w:pPr>
             <w:r>
@@ -7400,7 +7400,7 @@
           </w:tcPr>
           <w:p>
             <w:pPr>
-              <w:spacing w:before="0" w:after="0"/>
+              <w:spacing w:before="0" w:after="0" w:line="240" w:lineRule="auto"/>
               <w:jc w:val="center"/>
             </w:pPr>
             <w:r>
@@ -7431,7 +7431,7 @@
           </w:tcPr>
           <w:p>
             <w:pPr>
-              <w:spacing w:before="0" w:after="0"/>
+              <w:spacing w:before="0" w:after="0" w:line="240" w:lineRule="auto"/>
               <w:jc w:val="both"/>
             </w:pPr>
             <w:r>
@@ -7467,7 +7467,7 @@
           </w:tcPr>
           <w:p>
             <w:pPr>
-              <w:spacing w:before="0" w:after="0"/>
+              <w:spacing w:before="0" w:after="0" w:line="240" w:lineRule="auto"/>
               <w:jc w:val="both"/>
             </w:pPr>
             <w:r>
@@ -7498,7 +7498,7 @@
           </w:tcPr>
           <w:p>
             <w:pPr>
-              <w:spacing w:before="0" w:after="0"/>
+              <w:spacing w:before="0" w:after="0" w:line="240" w:lineRule="auto"/>
               <w:jc w:val="both"/>
             </w:pPr>
             <w:r>
@@ -7534,7 +7534,7 @@
           </w:tcPr>
           <w:p>
             <w:pPr>
-              <w:spacing w:before="0" w:after="0"/>
+              <w:spacing w:before="0" w:after="0" w:line="240" w:lineRule="auto"/>
               <w:jc w:val="center"/>
             </w:pPr>
             <w:r>
@@ -7565,7 +7565,7 @@
           </w:tcPr>
           <w:p>
             <w:pPr>
-              <w:spacing w:before="0" w:after="0"/>
+              <w:spacing w:before="0" w:after="0" w:line="240" w:lineRule="auto"/>
               <w:jc w:val="both"/>
             </w:pPr>
             <w:r>
@@ -7601,7 +7601,7 @@
           </w:tcPr>
           <w:p>
             <w:pPr>
-              <w:spacing w:before="0" w:after="0"/>
+              <w:spacing w:before="0" w:after="0" w:line="240" w:lineRule="auto"/>
               <w:jc w:val="both"/>
             </w:pPr>
             <w:r>
@@ -7632,7 +7632,7 @@
           </w:tcPr>
           <w:p>
             <w:pPr>
-              <w:spacing w:before="0" w:after="0"/>
+              <w:spacing w:before="0" w:after="0" w:line="240" w:lineRule="auto"/>
               <w:jc w:val="both"/>
             </w:pPr>
             <w:r>
@@ -7758,20 +7758,20 @@
       <w:pPr>
         <w:pStyle w:val="Endure-Subhead"/>
         <w:keepNext/>
-        <w:spacing w:before="240" w:after="60"/>
+        <w:spacing w:before="240" w:after="60" w:line="240" w:lineRule="auto"/>
         <w:outlineLvl w:val="1"/>
       </w:pPr>
       <w:r>
         <w:rPr>
           <w:sz w:val="24"/>
         </w:rPr>
-        <w:t>0.6 Verificación de Especificaciones del Sistema</w:t>
+        <w:t>1.6 Verificación de Especificaciones del Sistema</w:t>
       </w:r>
     </w:p>
     <w:p>
       <w:pPr>
         <w:pStyle w:val="Endure-FirstParagraphBodyText"/>
-        <w:spacing w:before="100" w:after="100"/>
+        <w:spacing w:before="100" w:after="100" w:line="240" w:lineRule="auto"/>
       </w:pPr>
       <w:r>
         <w:rPr>
@@ -8262,6 +8262,11 @@
     </w:p>
     <w:sectPr>
       <w:footerReference w:type="first" r:id="rId43"/>
+      <w:headerReference w:type="default" r:id="rId46"/>
+      <w:footerReference w:type="default" r:id="rId47"/>
+      <w:headerReference w:type="even" r:id="rId48"/>
+      <w:footerReference w:type="even" r:id="rId49"/>
+      <w:headerReference w:type="first" r:id="rId50"/>
       <w:type w:val="nextColumn"/>
       <w:pgSz w:w="10080" w:h="14400"/>
       <w:pgMar w:top="794" w:right="851" w:bottom="794" w:left="1077" w:header="454" w:footer="454" w:gutter="0"/>
@@ -9506,6 +9511,26 @@
 </w:ftr>
 </file>
 
+<file path=word/footer34.xml><?xml version="1.0" encoding="utf-8"?>
+<w:ftr xmlns:m="http://schemas.openxmlformats.org/officeDocument/2006/math" xmlns:mc="http://schemas.openxmlformats.org/markup-compatibility/2006" xmlns:mo="http://schemas.microsoft.com/office/mac/office/2008/main" xmlns:mv="urn:schemas-microsoft-com:mac:vml" xmlns:o="urn:schemas-microsoft-com:office:office" xmlns:r="http://schemas.openxmlformats.org/officeDocument/2006/relationships" xmlns:v="urn:schemas-microsoft-com:vml" xmlns:w10="urn:schemas-microsoft-com:office:word" xmlns:w14="http://schemas.microsoft.com/office/word/2010/wordml" xmlns:w="http://schemas.openxmlformats.org/wordprocessingml/2006/main" xmlns:wne="http://schemas.microsoft.com/office/word/2006/wordml" xmlns:wp14="http://schemas.microsoft.com/office/word/2010/wordprocessingDrawing" xmlns:wp="http://schemas.openxmlformats.org/drawingml/2006/wordprocessingDrawing" xmlns:wpc="http://schemas.microsoft.com/office/word/2010/wordprocessingCanvas" xmlns:wpg="http://schemas.microsoft.com/office/word/2010/wordprocessingGroup" xmlns:wpi="http://schemas.microsoft.com/office/word/2010/wordprocessingInk" xmlns:wps="http://schemas.microsoft.com/office/word/2010/wordprocessingShape" mc:Ignorable="w14 wp14">
+  <w:p>
+    <w:pPr>
+      <w:pStyle w:val="Footer"/>
+    </w:pPr>
+  </w:p>
+</w:ftr>
+</file>
+
+<file path=word/footer35.xml><?xml version="1.0" encoding="utf-8"?>
+<w:ftr xmlns:m="http://schemas.openxmlformats.org/officeDocument/2006/math" xmlns:mc="http://schemas.openxmlformats.org/markup-compatibility/2006" xmlns:mo="http://schemas.microsoft.com/office/mac/office/2008/main" xmlns:mv="urn:schemas-microsoft-com:mac:vml" xmlns:o="urn:schemas-microsoft-com:office:office" xmlns:r="http://schemas.openxmlformats.org/officeDocument/2006/relationships" xmlns:v="urn:schemas-microsoft-com:vml" xmlns:w10="urn:schemas-microsoft-com:office:word" xmlns:w14="http://schemas.microsoft.com/office/word/2010/wordml" xmlns:w="http://schemas.openxmlformats.org/wordprocessingml/2006/main" xmlns:wne="http://schemas.microsoft.com/office/word/2006/wordml" xmlns:wp14="http://schemas.microsoft.com/office/word/2010/wordprocessingDrawing" xmlns:wp="http://schemas.openxmlformats.org/drawingml/2006/wordprocessingDrawing" xmlns:wpc="http://schemas.microsoft.com/office/word/2010/wordprocessingCanvas" xmlns:wpg="http://schemas.microsoft.com/office/word/2010/wordprocessingGroup" xmlns:wpi="http://schemas.microsoft.com/office/word/2010/wordprocessingInk" xmlns:wps="http://schemas.microsoft.com/office/word/2010/wordprocessingShape" mc:Ignorable="w14 wp14">
+  <w:p>
+    <w:pPr>
+      <w:pStyle w:val="Footer"/>
+    </w:pPr>
+  </w:p>
+</w:ftr>
+</file>
+
 <file path=word/footer4.xml><?xml version="1.0" encoding="utf-8"?>
 <w:ftr xmlns:wpc="http://schemas.microsoft.com/office/word/2010/wordprocessingCanvas" xmlns:cx="http://schemas.microsoft.com/office/drawing/2014/chartex" xmlns:cx1="http://schemas.microsoft.com/office/drawing/2015/9/8/chartex" xmlns:cx2="http://schemas.microsoft.com/office/drawing/2015/10/21/chartex" xmlns:cx3="http://schemas.microsoft.com/office/drawing/2016/5/9/chartex" xmlns:cx4="http://schemas.microsoft.com/office/drawing/2016/5/10/chartex" xmlns:cx5="http://schemas.microsoft.com/office/drawing/2016/5/11/chartex" xmlns:cx6="http://schemas.microsoft.com/office/drawing/2016/5/12/chartex" xmlns:cx7="http://schemas.microsoft.com/office/drawing/2016/5/13/chartex" xmlns:cx8="http://schemas.microsoft.com/office/drawing/2016/5/14/chartex" xmlns:mc="http://schemas.openxmlformats.org/markup-compatibility/2006" xmlns:aink="http://schemas.microsoft.com/office/drawing/2016/ink" xmlns:am3d="http://schemas.microsoft.com/office/drawing/2017/model3d" xmlns:o="urn:schemas-microsoft-com:office:office" xmlns:oel="http://schemas.microsoft.com/office/2019/extlst" xmlns:r="http://schemas.openxmlformats.org/officeDocument/2006/relationships" xmlns:m="http://schemas.openxmlformats.org/officeDocument/2006/math" xmlns:v="urn:schemas-microsoft-com:vml" xmlns:wp14="http://schemas.microsoft.com/office/word/2010/wordprocessingDrawing" xmlns:wp="http://schemas.openxmlformats.org/drawingml/2006/wordprocessingDrawing" xmlns:w10="urn:schemas-microsoft-com:office:word" xmlns:w="http://schemas.openxmlformats.org/wordprocessingml/2006/main" xmlns:w14="http://schemas.microsoft.com/office/word/2010/wordml" xmlns:w15="http://schemas.microsoft.com/office/word/2012/wordml" xmlns:w16cex="http://schemas.microsoft.com/office/word/2018/wordml/cex" xmlns:w16cid="http://schemas.microsoft.com/office/word/2016/wordml/cid" xmlns:w16="http://schemas.microsoft.com/office/word/2018/wordml" xmlns:w16du="http://schemas.microsoft.com/office/word/2023/wordml/word16du" xmlns:w16sdtdh="http://schemas.microsoft.com/office/word/2020/wordml/sdtdatahash" xmlns:w16sdtfl="http://schemas.microsoft.com/office/word/2024/wordml/sdtformatlock" xmlns:w16se="http://schemas.microsoft.com/office/word/2015/wordml/symex" xmlns:wpg="http://schemas.microsoft.com/office/word/2010/wordprocessingGroup" xmlns:wpi="http://schemas.microsoft.com/office/word/2010/wordprocessingInk" xmlns:wne="http://schemas.microsoft.com/office/word/2006/wordml" xmlns:wps="http://schemas.microsoft.com/office/word/2010/wordprocessingShape" mc:Ignorable="w14 w15 w16se w16cid w16 w16cex w16sdtdh w16sdtfl w16du wp14">
   <w:p>
@@ -9763,6 +9788,36 @@
     <w:r>
       <w:t>TÍTULO DEL LIBRO</w:t>
     </w:r>
+  </w:p>
+</w:hdr>
+</file>
+
+<file path=word/header3.xml><?xml version="1.0" encoding="utf-8"?>
+<w:hdr xmlns:m="http://schemas.openxmlformats.org/officeDocument/2006/math" xmlns:mc="http://schemas.openxmlformats.org/markup-compatibility/2006" xmlns:mo="http://schemas.microsoft.com/office/mac/office/2008/main" xmlns:mv="urn:schemas-microsoft-com:mac:vml" xmlns:o="urn:schemas-microsoft-com:office:office" xmlns:r="http://schemas.openxmlformats.org/officeDocument/2006/relationships" xmlns:v="urn:schemas-microsoft-com:vml" xmlns:w10="urn:schemas-microsoft-com:office:word" xmlns:w14="http://schemas.microsoft.com/office/word/2010/wordml" xmlns:w="http://schemas.openxmlformats.org/wordprocessingml/2006/main" xmlns:wne="http://schemas.microsoft.com/office/word/2006/wordml" xmlns:wp14="http://schemas.microsoft.com/office/word/2010/wordprocessingDrawing" xmlns:wp="http://schemas.openxmlformats.org/drawingml/2006/wordprocessingDrawing" xmlns:wpc="http://schemas.microsoft.com/office/word/2010/wordprocessingCanvas" xmlns:wpg="http://schemas.microsoft.com/office/word/2010/wordprocessingGroup" xmlns:wpi="http://schemas.microsoft.com/office/word/2010/wordprocessingInk" xmlns:wps="http://schemas.microsoft.com/office/word/2010/wordprocessingShape" mc:Ignorable="w14 wp14">
+  <w:p>
+    <w:pPr>
+      <w:pStyle w:val="Header"/>
+    </w:pPr>
+  </w:p>
+</w:hdr>
+</file>
+
+<file path=word/header4.xml><?xml version="1.0" encoding="utf-8"?>
+<w:hdr xmlns:m="http://schemas.openxmlformats.org/officeDocument/2006/math" xmlns:mc="http://schemas.openxmlformats.org/markup-compatibility/2006" xmlns:mo="http://schemas.microsoft.com/office/mac/office/2008/main" xmlns:mv="urn:schemas-microsoft-com:mac:vml" xmlns:o="urn:schemas-microsoft-com:office:office" xmlns:r="http://schemas.openxmlformats.org/officeDocument/2006/relationships" xmlns:v="urn:schemas-microsoft-com:vml" xmlns:w10="urn:schemas-microsoft-com:office:word" xmlns:w14="http://schemas.microsoft.com/office/word/2010/wordml" xmlns:w="http://schemas.openxmlformats.org/wordprocessingml/2006/main" xmlns:wne="http://schemas.microsoft.com/office/word/2006/wordml" xmlns:wp14="http://schemas.microsoft.com/office/word/2010/wordprocessingDrawing" xmlns:wp="http://schemas.openxmlformats.org/drawingml/2006/wordprocessingDrawing" xmlns:wpc="http://schemas.microsoft.com/office/word/2010/wordprocessingCanvas" xmlns:wpg="http://schemas.microsoft.com/office/word/2010/wordprocessingGroup" xmlns:wpi="http://schemas.microsoft.com/office/word/2010/wordprocessingInk" xmlns:wps="http://schemas.microsoft.com/office/word/2010/wordprocessingShape" mc:Ignorable="w14 wp14">
+  <w:p>
+    <w:pPr>
+      <w:pStyle w:val="Header"/>
+    </w:pPr>
+  </w:p>
+</w:hdr>
+</file>
+
+<file path=word/header5.xml><?xml version="1.0" encoding="utf-8"?>
+<w:hdr xmlns:m="http://schemas.openxmlformats.org/officeDocument/2006/math" xmlns:mc="http://schemas.openxmlformats.org/markup-compatibility/2006" xmlns:mo="http://schemas.microsoft.com/office/mac/office/2008/main" xmlns:mv="urn:schemas-microsoft-com:mac:vml" xmlns:o="urn:schemas-microsoft-com:office:office" xmlns:r="http://schemas.openxmlformats.org/officeDocument/2006/relationships" xmlns:v="urn:schemas-microsoft-com:vml" xmlns:w10="urn:schemas-microsoft-com:office:word" xmlns:w14="http://schemas.microsoft.com/office/word/2010/wordml" xmlns:w="http://schemas.openxmlformats.org/wordprocessingml/2006/main" xmlns:wne="http://schemas.microsoft.com/office/word/2006/wordml" xmlns:wp14="http://schemas.microsoft.com/office/word/2010/wordprocessingDrawing" xmlns:wp="http://schemas.openxmlformats.org/drawingml/2006/wordprocessingDrawing" xmlns:wpc="http://schemas.microsoft.com/office/word/2010/wordprocessingCanvas" xmlns:wpg="http://schemas.microsoft.com/office/word/2010/wordprocessingGroup" xmlns:wpi="http://schemas.microsoft.com/office/word/2010/wordprocessingInk" xmlns:wps="http://schemas.microsoft.com/office/word/2010/wordprocessingShape" mc:Ignorable="w14 wp14">
+  <w:p>
+    <w:pPr>
+      <w:pStyle w:val="Header"/>
+    </w:pPr>
   </w:p>
 </w:hdr>
 </file>

</xml_diff>